<commit_message>
Regenerate the simulator documentation DOCX and PDF
Render version 1.1 with its diagrams.
</commit_message>
<xml_diff>
--- a/docs/SmartPot_DataGenerator_Documentation.docx
+++ b/docs/SmartPot_DataGenerator_Documentation.docx
@@ -359,7 +359,7 @@
                 <w:sz w:val="19"/>
                 <w:szCs w:val="19"/>
               </w:rPr>
-              <w:t xml:space="preserve">1.0 · septiembre 2026</w:t>
+              <w:t xml:space="preserve">1.1 · octubre 2026</w:t>
             </w:r>
             <w:r>
               <w:rPr>
@@ -729,7 +729,7 @@
                 <w:sz w:val="17"/>
                 <w:szCs w:val="17"/>
               </w:rPr>
-              <w:t xml:space="preserve">1.0 · septiembre 2026</w:t>
+              <w:t xml:space="preserve">1.1 · octubre 2026</w:t>
             </w:r>
           </w:p>
         </w:tc>
@@ -1872,6 +1872,596 @@
     </w:p>
     <w:p>
       <w:pPr>
+        <w:spacing w:before="80" w:after="0" w:line="240" w:lineRule="auto"/>
+        <w:rPr>
+          <w:sz w:val="8"/>
+        </w:rPr>
+      </w:pPr>
+    </w:p>
+    <w:tbl>
+      <w:tblPr>
+        <w:tblW w:w="9360" w:type="dxa"/>
+        <w:tblInd w:w="0" w:type="dxa"/>
+        <w:tblBorders>
+          <w:top w:val="nil"/>
+          <w:left w:val="nil"/>
+          <w:bottom w:val="nil"/>
+          <w:right w:val="nil"/>
+          <w:insideH w:val="nil"/>
+          <w:insideV w:val="nil"/>
+        </w:tblBorders>
+        <w:tblLayout w:type="fixed"/>
+        <w:tblCellMar>
+          <w:left w:w="0" w:type="dxa"/>
+          <w:right w:w="0" w:type="dxa"/>
+        </w:tblCellMar>
+        <w:tblLook w:val="0000" w:firstRow="0" w:lastRow="0" w:firstColumn="0" w:lastColumn="0" w:noHBand="1" w:noVBand="1"/>
+      </w:tblPr>
+      <w:tblGrid>
+        <w:gridCol w:w="9360"/>
+      </w:tblGrid>
+      <w:tr>
+        <w:trPr>
+          <w:cantSplit/>
+        </w:trPr>
+        <w:tc>
+          <w:tcPr>
+            <w:tcW w:w="9360" w:type="dxa"/>
+            <w:shd w:val="clear" w:color="auto" w:fill="0B3D2B"/>
+            <w:tcMar>
+              <w:top w:w="60" w:type="dxa"/>
+              <w:left w:w="200" w:type="dxa"/>
+              <w:bottom w:w="60" w:type="dxa"/>
+              <w:right w:w="200" w:type="dxa"/>
+            </w:tcMar>
+            <w:vAlign w:val="top"/>
+          </w:tcPr>
+          <w:p>
+            <w:pPr>
+              <w:spacing w:before="0" w:after="0" w:line="240" w:lineRule="auto"/>
+            </w:pPr>
+            <w:r>
+              <w:rPr>
+                <w:b/>
+                <w:bCs/>
+                <w:color w:val="7FDBB0"/>
+                <w:spacing w:val="40"/>
+                <w:sz w:val="14"/>
+                <w:szCs w:val="14"/>
+              </w:rPr>
+              <w:t xml:space="preserve">MERMAID</w:t>
+            </w:r>
+          </w:p>
+        </w:tc>
+      </w:tr>
+    </w:tbl>
+    <w:tbl>
+      <w:tblPr>
+        <w:tblW w:w="9360" w:type="dxa"/>
+        <w:tblInd w:w="0" w:type="dxa"/>
+        <w:tblBorders>
+          <w:top w:val="nil"/>
+          <w:left w:val="nil"/>
+          <w:bottom w:val="nil"/>
+          <w:right w:val="nil"/>
+          <w:insideH w:val="nil"/>
+          <w:insideV w:val="nil"/>
+        </w:tblBorders>
+        <w:tblLayout w:type="fixed"/>
+        <w:tblCellMar>
+          <w:left w:w="0" w:type="dxa"/>
+          <w:right w:w="0" w:type="dxa"/>
+        </w:tblCellMar>
+        <w:tblLook w:val="0000" w:firstRow="0" w:lastRow="0" w:firstColumn="0" w:lastColumn="0" w:noHBand="1" w:noVBand="1"/>
+      </w:tblPr>
+      <w:tblGrid>
+        <w:gridCol w:w="9360"/>
+      </w:tblGrid>
+      <w:tr>
+        <w:trPr>
+          <w:cantSplit/>
+        </w:trPr>
+        <w:tc>
+          <w:tcPr>
+            <w:tcW w:w="9360" w:type="dxa"/>
+            <w:shd w:val="clear" w:color="auto" w:fill="F7FAF8"/>
+            <w:tcMar>
+              <w:top w:w="120" w:type="dxa"/>
+              <w:left w:w="200" w:type="dxa"/>
+              <w:bottom w:w="120" w:type="dxa"/>
+              <w:right w:w="200" w:type="dxa"/>
+            </w:tcMar>
+            <w:vAlign w:val="top"/>
+          </w:tcPr>
+          <w:p>
+            <w:pPr>
+              <w:spacing w:before="0" w:after="0" w:line="252" w:lineRule="auto"/>
+            </w:pPr>
+            <w:r>
+              <w:rPr>
+                <w:rFonts w:ascii="JetBrains Mono" w:hAnsi="JetBrains Mono" w:eastAsia="JetBrains Mono" w:cs="JetBrains Mono"/>
+                <w:color w:val="17261F"/>
+                <w:sz w:val="16"/>
+                <w:szCs w:val="16"/>
+              </w:rPr>
+              <w:t xml:space="preserve">%%{init: {"theme": "base", "fontFamily": "Segoe UI, Arial, sans-serif", "themeVariables": {"fontFamily": "Segoe UI, Arial, sans-serif", "fontSize": "15px", "primaryColor": "#DDF5EA", "primaryTextColor": "#17261F", "primaryBorderColor": "#067A52", "secondaryColor": "#E3F2FB", "secondaryTextColor": "#17261F", "secondaryBorderColor": "#1F6FA0", "tertiaryColor": "#F2F7F4", "tertiaryTextColor": "#17261F", "tertiaryBorderColor": "#D5E3DC", "lineColor": "#5B6B63", "textColor": "#17261F", "mainBkg": "#DDF5EA", "nodeBorder": "#067A52", "clusterBkg": "#F7FAF8", "clusterBorder": "#D5E3DC", "edgeLabelBackground": "#FFFFFF", "actorBkg": "#067A52", "actorBorder": "#0B3D2B", "actorTextColor": "#FFFFFF", "actorLineColor": "#5B6B63", "signalColor": "#17261F", "signalTextColor": "#17261F", "labelBoxBkgColor": "#0B3D2B", "labelBoxBorderColor": "#0B3D2B", "labelTextColor": "#FFFFFF", "loopTextColor": "#0B3D2B", "noteBkgColor": "#FDF4DD", "noteBorderColor": "#C98D12", "noteTextColor": "#17261F", "activationBkgColor": "#DDF5EA", "activationBorderColor": "#067A52", "attributeBackgroundColorOdd": "#FFFFFF", "attributeBackgroundColorEven": "#F2F7F4"}, "layout": "elk", "elk": {"nodePlacementStrategy": "BRANDES_KOEPF", "mergeEdges": false, "cycleBreakingStrategy": "GREEDY"}}}%%</w:t>
+            </w:r>
+          </w:p>
+          <w:p>
+            <w:pPr>
+              <w:spacing w:before="0" w:after="0" w:line="252" w:lineRule="auto"/>
+            </w:pPr>
+            <w:r>
+              <w:rPr>
+                <w:rFonts w:ascii="JetBrains Mono" w:hAnsi="JetBrains Mono" w:eastAsia="JetBrains Mono" w:cs="JetBrains Mono"/>
+                <w:color w:val="17261F"/>
+                <w:sz w:val="16"/>
+                <w:szCs w:val="16"/>
+              </w:rPr>
+              <w:t xml:space="preserve">flowchart LR</w:t>
+            </w:r>
+          </w:p>
+          <w:p>
+            <w:pPr>
+              <w:spacing w:before="0" w:after="0" w:line="252" w:lineRule="auto"/>
+            </w:pPr>
+            <w:r>
+              <w:rPr>
+                <w:rFonts w:ascii="JetBrains Mono" w:hAnsi="JetBrains Mono" w:eastAsia="JetBrains Mono" w:cs="JetBrains Mono"/>
+                <w:color w:val="17261F"/>
+                <w:sz w:val="16"/>
+                <w:szCs w:val="16"/>
+              </w:rPr>
+              <w:t xml:space="preserve">  api["SmartPot-API&lt;br/&gt;VirtualDeviceService"]</w:t>
+            </w:r>
+          </w:p>
+          <w:p>
+            <w:pPr>
+              <w:spacing w:before="0" w:after="0" w:line="252" w:lineRule="auto"/>
+            </w:pPr>
+            <w:r>
+              <w:rPr>
+                <w:rFonts w:ascii="JetBrains Mono" w:hAnsi="JetBrains Mono" w:eastAsia="JetBrains Mono" w:cs="JetBrains Mono"/>
+                <w:color w:val="17261F"/>
+                <w:sz w:val="16"/>
+                <w:szCs w:val="16"/>
+              </w:rPr>
+              <w:t xml:space="preserve">  meteo["Open-Meteo&lt;br/&gt;clima y geocodificación"]</w:t>
+            </w:r>
+          </w:p>
+          <w:p>
+            <w:pPr>
+              <w:spacing w:before="0" w:after="0" w:line="252" w:lineRule="auto"/>
+            </w:pPr>
+            <w:r>
+              <w:rPr>
+                <w:rFonts w:ascii="JetBrains Mono" w:hAnsi="JetBrains Mono" w:eastAsia="JetBrains Mono" w:cs="JetBrains Mono"/>
+                <w:color w:val="17261F"/>
+                <w:sz w:val="16"/>
+                <w:szCs w:val="16"/>
+              </w:rPr>
+              <w:t xml:space="preserve">  broker["SmartPot-Broker&lt;br/&gt;MQTT"]</w:t>
+            </w:r>
+          </w:p>
+          <w:p>
+            <w:pPr>
+              <w:spacing w:before="0" w:after="0" w:line="252" w:lineRule="auto"/>
+            </w:pPr>
+            <w:r>
+              <w:rPr>
+                <w:rFonts w:ascii="JetBrains Mono" w:hAnsi="JetBrains Mono" w:eastAsia="JetBrains Mono" w:cs="JetBrains Mono"/>
+                <w:color w:val="17261F"/>
+                <w:sz w:val="16"/>
+                <w:szCs w:val="16"/>
+              </w:rPr>
+              <w:t xml:space="preserve">  subgraph sim["SmartPot-DataGenerator · Python 3.13"]</w:t>
+            </w:r>
+          </w:p>
+          <w:p>
+            <w:pPr>
+              <w:spacing w:before="0" w:after="0" w:line="252" w:lineRule="auto"/>
+            </w:pPr>
+            <w:r>
+              <w:rPr>
+                <w:rFonts w:ascii="JetBrains Mono" w:hAnsi="JetBrains Mono" w:eastAsia="JetBrains Mono" w:cs="JetBrains Mono"/>
+                <w:color w:val="17261F"/>
+                <w:sz w:val="16"/>
+                <w:szCs w:val="16"/>
+              </w:rPr>
+              <w:t xml:space="preserve">    direction TB</w:t>
+            </w:r>
+          </w:p>
+          <w:p>
+            <w:pPr>
+              <w:spacing w:before="0" w:after="0" w:line="252" w:lineRule="auto"/>
+            </w:pPr>
+            <w:r>
+              <w:rPr>
+                <w:rFonts w:ascii="JetBrains Mono" w:hAnsi="JetBrains Mono" w:eastAsia="JetBrains Mono" w:cs="JetBrains Mono"/>
+                <w:color w:val="17261F"/>
+                <w:sz w:val="16"/>
+                <w:szCs w:val="16"/>
+              </w:rPr>
+              <w:t xml:space="preserve">    main["__main__&lt;br/&gt;arranca los cultivos fijos,&lt;br/&gt;el hilo de publicación y la API"]</w:t>
+            </w:r>
+          </w:p>
+          <w:p>
+            <w:pPr>
+              <w:spacing w:before="0" w:after="0" w:line="252" w:lineRule="auto"/>
+            </w:pPr>
+            <w:r>
+              <w:rPr>
+                <w:rFonts w:ascii="JetBrains Mono" w:hAnsi="JetBrains Mono" w:eastAsia="JetBrains Mono" w:cs="JetBrains Mono"/>
+                <w:color w:val="17261F"/>
+                <w:sz w:val="16"/>
+                <w:szCs w:val="16"/>
+              </w:rPr>
+              <w:t xml:space="preserve">    config["config&lt;br/&gt;SIMULATOR_DEVICES · MQTT · token"]</w:t>
+            </w:r>
+          </w:p>
+          <w:p>
+            <w:pPr>
+              <w:spacing w:before="0" w:after="0" w:line="252" w:lineRule="auto"/>
+            </w:pPr>
+            <w:r>
+              <w:rPr>
+                <w:rFonts w:ascii="JetBrains Mono" w:hAnsi="JetBrains Mono" w:eastAsia="JetBrains Mono" w:cs="JetBrains Mono"/>
+                <w:color w:val="17261F"/>
+                <w:sz w:val="16"/>
+                <w:szCs w:val="16"/>
+              </w:rPr>
+              <w:t xml:space="preserve">    control["api.py · FastAPI :8081&lt;br/&gt;/v1/pots · /v1/places · /v1/weather&lt;br/&gt;token Bearer"]</w:t>
+            </w:r>
+          </w:p>
+          <w:p>
+            <w:pPr>
+              <w:spacing w:before="0" w:after="0" w:line="252" w:lineRule="auto"/>
+            </w:pPr>
+            <w:r>
+              <w:rPr>
+                <w:rFonts w:ascii="JetBrains Mono" w:hAnsi="JetBrains Mono" w:eastAsia="JetBrains Mono" w:cs="JetBrains Mono"/>
+                <w:color w:val="17261F"/>
+                <w:sz w:val="16"/>
+                <w:szCs w:val="16"/>
+              </w:rPr>
+              <w:t xml:space="preserve">    manager["pots.py · PotManager&lt;br/&gt;un VirtualPot por cultivo&lt;br/&gt;altas, cambios y retiros en caliente"]</w:t>
+            </w:r>
+          </w:p>
+          <w:p>
+            <w:pPr>
+              <w:spacing w:before="0" w:after="0" w:line="252" w:lineRule="auto"/>
+            </w:pPr>
+            <w:r>
+              <w:rPr>
+                <w:rFonts w:ascii="JetBrains Mono" w:hAnsi="JetBrains Mono" w:eastAsia="JetBrains Mono" w:cs="JetBrains Mono"/>
+                <w:color w:val="17261F"/>
+                <w:sz w:val="16"/>
+                <w:szCs w:val="16"/>
+              </w:rPr>
+              <w:t xml:space="preserve">    env["environment.py&lt;br/&gt;modelo físico · modos AUTO, MANUAL, WEATHER&lt;br/&gt;efecto de los actuadores · ruido"]</w:t>
+            </w:r>
+          </w:p>
+          <w:p>
+            <w:pPr>
+              <w:spacing w:before="0" w:after="0" w:line="252" w:lineRule="auto"/>
+            </w:pPr>
+            <w:r>
+              <w:rPr>
+                <w:rFonts w:ascii="JetBrains Mono" w:hAnsi="JetBrains Mono" w:eastAsia="JetBrains Mono" w:cs="JetBrains Mono"/>
+                <w:color w:val="17261F"/>
+                <w:sz w:val="16"/>
+                <w:szCs w:val="16"/>
+              </w:rPr>
+              <w:t xml:space="preserve">    weather["weather.py&lt;br/&gt;clima actual con caché de 10 min&lt;br/&gt;buscador de lugares"]</w:t>
+            </w:r>
+          </w:p>
+          <w:p>
+            <w:pPr>
+              <w:spacing w:before="0" w:after="0" w:line="252" w:lineRule="auto"/>
+            </w:pPr>
+            <w:r>
+              <w:rPr>
+                <w:rFonts w:ascii="JetBrains Mono" w:hAnsi="JetBrains Mono" w:eastAsia="JetBrains Mono" w:cs="JetBrains Mono"/>
+                <w:color w:val="17261F"/>
+                <w:sz w:val="16"/>
+                <w:szCs w:val="16"/>
+              </w:rPr>
+              <w:t xml:space="preserve">    device["device.py · SimulatedDevice&lt;br/&gt;cliente MQTT con la cuenta del cultivo&lt;br/&gt;telemetría · comandos · ACK · estado"]</w:t>
+            </w:r>
+          </w:p>
+          <w:p>
+            <w:pPr>
+              <w:spacing w:before="0" w:after="0" w:line="252" w:lineRule="auto"/>
+            </w:pPr>
+            <w:r>
+              <w:rPr>
+                <w:rFonts w:ascii="JetBrains Mono" w:hAnsi="JetBrains Mono" w:eastAsia="JetBrains Mono" w:cs="JetBrains Mono"/>
+                <w:color w:val="17261F"/>
+                <w:sz w:val="16"/>
+                <w:szCs w:val="16"/>
+              </w:rPr>
+              <w:t xml:space="preserve">  end</w:t>
+            </w:r>
+          </w:p>
+          <w:p>
+            <w:pPr>
+              <w:spacing w:before="0" w:after="0" w:line="252" w:lineRule="auto"/>
+            </w:pPr>
+            <w:r>
+              <w:rPr>
+                <w:rFonts w:ascii="JetBrains Mono" w:hAnsi="JetBrains Mono" w:eastAsia="JetBrains Mono" w:cs="JetBrains Mono"/>
+                <w:color w:val="17261F"/>
+                <w:sz w:val="16"/>
+                <w:szCs w:val="16"/>
+              </w:rPr>
+              <w:t xml:space="preserve">  api --&gt;|"PUT · GET · DELETE /v1/pots&lt;br/&gt;solo red interna"| control</w:t>
+            </w:r>
+          </w:p>
+          <w:p>
+            <w:pPr>
+              <w:spacing w:before="0" w:after="0" w:line="252" w:lineRule="auto"/>
+            </w:pPr>
+            <w:r>
+              <w:rPr>
+                <w:rFonts w:ascii="JetBrains Mono" w:hAnsi="JetBrains Mono" w:eastAsia="JetBrains Mono" w:cs="JetBrains Mono"/>
+                <w:color w:val="17261F"/>
+                <w:sz w:val="16"/>
+                <w:szCs w:val="16"/>
+              </w:rPr>
+              <w:t xml:space="preserve">  main --&gt; config &amp; control &amp; manager</w:t>
+            </w:r>
+          </w:p>
+          <w:p>
+            <w:pPr>
+              <w:spacing w:before="0" w:after="0" w:line="252" w:lineRule="auto"/>
+            </w:pPr>
+            <w:r>
+              <w:rPr>
+                <w:rFonts w:ascii="JetBrains Mono" w:hAnsi="JetBrains Mono" w:eastAsia="JetBrains Mono" w:cs="JetBrains Mono"/>
+                <w:color w:val="17261F"/>
+                <w:sz w:val="16"/>
+                <w:szCs w:val="16"/>
+              </w:rPr>
+              <w:t xml:space="preserve">  control --&gt; manager</w:t>
+            </w:r>
+          </w:p>
+          <w:p>
+            <w:pPr>
+              <w:spacing w:before="0" w:after="0" w:line="252" w:lineRule="auto"/>
+            </w:pPr>
+            <w:r>
+              <w:rPr>
+                <w:rFonts w:ascii="JetBrains Mono" w:hAnsi="JetBrains Mono" w:eastAsia="JetBrains Mono" w:cs="JetBrains Mono"/>
+                <w:color w:val="17261F"/>
+                <w:sz w:val="16"/>
+                <w:szCs w:val="16"/>
+              </w:rPr>
+              <w:t xml:space="preserve">  manager --&gt; env &amp; device</w:t>
+            </w:r>
+          </w:p>
+          <w:p>
+            <w:pPr>
+              <w:spacing w:before="0" w:after="0" w:line="252" w:lineRule="auto"/>
+            </w:pPr>
+            <w:r>
+              <w:rPr>
+                <w:rFonts w:ascii="JetBrains Mono" w:hAnsi="JetBrains Mono" w:eastAsia="JetBrains Mono" w:cs="JetBrains Mono"/>
+                <w:color w:val="17261F"/>
+                <w:sz w:val="16"/>
+                <w:szCs w:val="16"/>
+              </w:rPr>
+              <w:t xml:space="preserve">  env --&gt; weather</w:t>
+            </w:r>
+          </w:p>
+          <w:p>
+            <w:pPr>
+              <w:spacing w:before="0" w:after="0" w:line="252" w:lineRule="auto"/>
+            </w:pPr>
+            <w:r>
+              <w:rPr>
+                <w:rFonts w:ascii="JetBrains Mono" w:hAnsi="JetBrains Mono" w:eastAsia="JetBrains Mono" w:cs="JetBrains Mono"/>
+                <w:color w:val="17261F"/>
+                <w:sz w:val="16"/>
+                <w:szCs w:val="16"/>
+              </w:rPr>
+              <w:t xml:space="preserve">  weather --&gt;|"HTTPS"| meteo</w:t>
+            </w:r>
+          </w:p>
+          <w:p>
+            <w:pPr>
+              <w:spacing w:before="0" w:after="0" w:line="252" w:lineRule="auto"/>
+            </w:pPr>
+            <w:r>
+              <w:rPr>
+                <w:rFonts w:ascii="JetBrains Mono" w:hAnsi="JetBrains Mono" w:eastAsia="JetBrains Mono" w:cs="JetBrains Mono"/>
+                <w:color w:val="17261F"/>
+                <w:sz w:val="16"/>
+                <w:szCs w:val="16"/>
+              </w:rPr>
+              <w:t xml:space="preserve">  device &lt;--&gt;|"smartpot/v1/cropId/*"| broker</w:t>
+            </w:r>
+          </w:p>
+          <w:p>
+            <w:pPr>
+              <w:spacing w:before="0" w:after="0" w:line="252" w:lineRule="auto"/>
+            </w:pPr>
+            <w:r>
+              <w:rPr>
+                <w:rFonts w:ascii="JetBrains Mono" w:hAnsi="JetBrains Mono" w:eastAsia="JetBrains Mono" w:cs="JetBrains Mono"/>
+                <w:color w:val="17261F"/>
+                <w:sz w:val="16"/>
+                <w:szCs w:val="16"/>
+              </w:rPr>
+              <w:t xml:space="preserve">  classDef leaf fill:#DDF5EA,stroke:#067A52,color:#17261F</w:t>
+            </w:r>
+          </w:p>
+          <w:p>
+            <w:pPr>
+              <w:spacing w:before="0" w:after="0" w:line="252" w:lineRule="auto"/>
+            </w:pPr>
+            <w:r>
+              <w:rPr>
+                <w:rFonts w:ascii="JetBrains Mono" w:hAnsi="JetBrains Mono" w:eastAsia="JetBrains Mono" w:cs="JetBrains Mono"/>
+                <w:color w:val="17261F"/>
+                <w:sz w:val="16"/>
+                <w:szCs w:val="16"/>
+              </w:rPr>
+              <w:t xml:space="preserve">  classDef water fill:#E3F2FB,stroke:#1F6FA0,color:#17261F</w:t>
+            </w:r>
+          </w:p>
+          <w:p>
+            <w:pPr>
+              <w:spacing w:before="0" w:after="0" w:line="252" w:lineRule="auto"/>
+            </w:pPr>
+            <w:r>
+              <w:rPr>
+                <w:rFonts w:ascii="JetBrains Mono" w:hAnsi="JetBrains Mono" w:eastAsia="JetBrains Mono" w:cs="JetBrains Mono"/>
+                <w:color w:val="17261F"/>
+                <w:sz w:val="16"/>
+                <w:szCs w:val="16"/>
+              </w:rPr>
+              <w:t xml:space="preserve">  classDef sun fill:#FDF4DD,stroke:#C98D12,color:#17261F</w:t>
+            </w:r>
+          </w:p>
+          <w:p>
+            <w:pPr>
+              <w:spacing w:before="0" w:after="0" w:line="252" w:lineRule="auto"/>
+            </w:pPr>
+            <w:r>
+              <w:rPr>
+                <w:rFonts w:ascii="JetBrains Mono" w:hAnsi="JetBrains Mono" w:eastAsia="JetBrains Mono" w:cs="JetBrains Mono"/>
+                <w:color w:val="17261F"/>
+                <w:sz w:val="16"/>
+                <w:szCs w:val="16"/>
+              </w:rPr>
+              <w:t xml:space="preserve">  classDef clay fill:#FBE9E1,stroke:#B85A38,color:#17261F</w:t>
+            </w:r>
+          </w:p>
+          <w:p>
+            <w:pPr>
+              <w:spacing w:before="0" w:after="0" w:line="252" w:lineRule="auto"/>
+            </w:pPr>
+            <w:r>
+              <w:rPr>
+                <w:rFonts w:ascii="JetBrains Mono" w:hAnsi="JetBrains Mono" w:eastAsia="JetBrains Mono" w:cs="JetBrains Mono"/>
+                <w:color w:val="17261F"/>
+                <w:sz w:val="16"/>
+                <w:szCs w:val="16"/>
+              </w:rPr>
+              <w:t xml:space="preserve">  classDef core fill:#067A52,stroke:#0B3D2B,color:#FFFFFF</w:t>
+            </w:r>
+          </w:p>
+          <w:p>
+            <w:pPr>
+              <w:spacing w:before="0" w:after="0" w:line="252" w:lineRule="auto"/>
+            </w:pPr>
+            <w:r>
+              <w:rPr>
+                <w:rFonts w:ascii="JetBrains Mono" w:hAnsi="JetBrains Mono" w:eastAsia="JetBrains Mono" w:cs="JetBrains Mono"/>
+                <w:color w:val="17261F"/>
+                <w:sz w:val="16"/>
+                <w:szCs w:val="16"/>
+              </w:rPr>
+              <w:t xml:space="preserve">  classDef deep fill:#0B3D2B,stroke:#06281C,color:#FFFFFF</w:t>
+            </w:r>
+          </w:p>
+          <w:p>
+            <w:pPr>
+              <w:spacing w:before="0" w:after="0" w:line="252" w:lineRule="auto"/>
+            </w:pPr>
+            <w:r>
+              <w:rPr>
+                <w:rFonts w:ascii="JetBrains Mono" w:hAnsi="JetBrains Mono" w:eastAsia="JetBrains Mono" w:cs="JetBrains Mono"/>
+                <w:color w:val="17261F"/>
+                <w:sz w:val="16"/>
+                <w:szCs w:val="16"/>
+              </w:rPr>
+              <w:t xml:space="preserve">  classDef muted fill:#F2F7F4,stroke:#5B6B63,color:#17261F</w:t>
+            </w:r>
+          </w:p>
+          <w:p>
+            <w:pPr>
+              <w:spacing w:before="0" w:after="0" w:line="252" w:lineRule="auto"/>
+            </w:pPr>
+            <w:r>
+              <w:rPr>
+                <w:rFonts w:ascii="JetBrains Mono" w:hAnsi="JetBrains Mono" w:eastAsia="JetBrains Mono" w:cs="JetBrains Mono"/>
+                <w:color w:val="17261F"/>
+                <w:sz w:val="16"/>
+                <w:szCs w:val="16"/>
+              </w:rPr>
+              <w:t xml:space="preserve">  class api,meteo,broker water</w:t>
+            </w:r>
+          </w:p>
+          <w:p>
+            <w:pPr>
+              <w:spacing w:before="0" w:after="0" w:line="252" w:lineRule="auto"/>
+            </w:pPr>
+            <w:r>
+              <w:rPr>
+                <w:rFonts w:ascii="JetBrains Mono" w:hAnsi="JetBrains Mono" w:eastAsia="JetBrains Mono" w:cs="JetBrains Mono"/>
+                <w:color w:val="17261F"/>
+                <w:sz w:val="16"/>
+                <w:szCs w:val="16"/>
+              </w:rPr>
+              <w:t xml:space="preserve">  class main,config muted</w:t>
+            </w:r>
+          </w:p>
+          <w:p>
+            <w:pPr>
+              <w:spacing w:before="0" w:after="0" w:line="252" w:lineRule="auto"/>
+            </w:pPr>
+            <w:r>
+              <w:rPr>
+                <w:rFonts w:ascii="JetBrains Mono" w:hAnsi="JetBrains Mono" w:eastAsia="JetBrains Mono" w:cs="JetBrains Mono"/>
+                <w:color w:val="17261F"/>
+                <w:sz w:val="16"/>
+                <w:szCs w:val="16"/>
+              </w:rPr>
+              <w:t xml:space="preserve">  class control sun</w:t>
+            </w:r>
+          </w:p>
+          <w:p>
+            <w:pPr>
+              <w:spacing w:before="0" w:after="0" w:line="252" w:lineRule="auto"/>
+            </w:pPr>
+            <w:r>
+              <w:rPr>
+                <w:rFonts w:ascii="JetBrains Mono" w:hAnsi="JetBrains Mono" w:eastAsia="JetBrains Mono" w:cs="JetBrains Mono"/>
+                <w:color w:val="17261F"/>
+                <w:sz w:val="16"/>
+                <w:szCs w:val="16"/>
+              </w:rPr>
+              <w:t xml:space="preserve">  class manager core</w:t>
+            </w:r>
+          </w:p>
+          <w:p>
+            <w:pPr>
+              <w:spacing w:before="0" w:after="0" w:line="252" w:lineRule="auto"/>
+            </w:pPr>
+            <w:r>
+              <w:rPr>
+                <w:rFonts w:ascii="JetBrains Mono" w:hAnsi="JetBrains Mono" w:eastAsia="JetBrains Mono" w:cs="JetBrains Mono"/>
+                <w:color w:val="17261F"/>
+                <w:sz w:val="16"/>
+                <w:szCs w:val="16"/>
+              </w:rPr>
+              <w:t xml:space="preserve">  class env,weather,device leaf</w:t>
+            </w:r>
+          </w:p>
+        </w:tc>
+      </w:tr>
+    </w:tbl>
+    <w:p>
+      <w:pPr>
+        <w:spacing w:before="160" w:after="0" w:line="240" w:lineRule="auto"/>
+        <w:rPr>
+          <w:sz w:val="8"/>
+        </w:rPr>
+      </w:pPr>
+    </w:p>
+    <w:p>
+      <w:pPr>
         <w:pageBreakBefore/>
         <w:spacing w:before="0" w:after="0" w:line="20" w:lineRule="exact"/>
         <w:rPr>
@@ -2066,6 +2656,470 @@
     </w:p>
     <w:p>
       <w:pPr>
+        <w:spacing w:before="80" w:after="0" w:line="240" w:lineRule="auto"/>
+        <w:rPr>
+          <w:sz w:val="8"/>
+        </w:rPr>
+      </w:pPr>
+    </w:p>
+    <w:tbl>
+      <w:tblPr>
+        <w:tblW w:w="9360" w:type="dxa"/>
+        <w:tblInd w:w="0" w:type="dxa"/>
+        <w:tblBorders>
+          <w:top w:val="nil"/>
+          <w:left w:val="nil"/>
+          <w:bottom w:val="nil"/>
+          <w:right w:val="nil"/>
+          <w:insideH w:val="nil"/>
+          <w:insideV w:val="nil"/>
+        </w:tblBorders>
+        <w:tblLayout w:type="fixed"/>
+        <w:tblCellMar>
+          <w:left w:w="0" w:type="dxa"/>
+          <w:right w:w="0" w:type="dxa"/>
+        </w:tblCellMar>
+        <w:tblLook w:val="0000" w:firstRow="0" w:lastRow="0" w:firstColumn="0" w:lastColumn="0" w:noHBand="1" w:noVBand="1"/>
+      </w:tblPr>
+      <w:tblGrid>
+        <w:gridCol w:w="9360"/>
+      </w:tblGrid>
+      <w:tr>
+        <w:trPr>
+          <w:cantSplit/>
+        </w:trPr>
+        <w:tc>
+          <w:tcPr>
+            <w:tcW w:w="9360" w:type="dxa"/>
+            <w:shd w:val="clear" w:color="auto" w:fill="0B3D2B"/>
+            <w:tcMar>
+              <w:top w:w="60" w:type="dxa"/>
+              <w:left w:w="200" w:type="dxa"/>
+              <w:bottom w:w="60" w:type="dxa"/>
+              <w:right w:w="200" w:type="dxa"/>
+            </w:tcMar>
+            <w:vAlign w:val="top"/>
+          </w:tcPr>
+          <w:p>
+            <w:pPr>
+              <w:spacing w:before="0" w:after="0" w:line="240" w:lineRule="auto"/>
+            </w:pPr>
+            <w:r>
+              <w:rPr>
+                <w:b/>
+                <w:bCs/>
+                <w:color w:val="7FDBB0"/>
+                <w:spacing w:val="40"/>
+                <w:sz w:val="14"/>
+                <w:szCs w:val="14"/>
+              </w:rPr>
+              <w:t xml:space="preserve">MERMAID</w:t>
+            </w:r>
+          </w:p>
+        </w:tc>
+      </w:tr>
+    </w:tbl>
+    <w:tbl>
+      <w:tblPr>
+        <w:tblW w:w="9360" w:type="dxa"/>
+        <w:tblInd w:w="0" w:type="dxa"/>
+        <w:tblBorders>
+          <w:top w:val="nil"/>
+          <w:left w:val="nil"/>
+          <w:bottom w:val="nil"/>
+          <w:right w:val="nil"/>
+          <w:insideH w:val="nil"/>
+          <w:insideV w:val="nil"/>
+        </w:tblBorders>
+        <w:tblLayout w:type="fixed"/>
+        <w:tblCellMar>
+          <w:left w:w="0" w:type="dxa"/>
+          <w:right w:w="0" w:type="dxa"/>
+        </w:tblCellMar>
+        <w:tblLook w:val="0000" w:firstRow="0" w:lastRow="0" w:firstColumn="0" w:lastColumn="0" w:noHBand="1" w:noVBand="1"/>
+      </w:tblPr>
+      <w:tblGrid>
+        <w:gridCol w:w="9360"/>
+      </w:tblGrid>
+      <w:tr>
+        <w:trPr>
+          <w:cantSplit/>
+        </w:trPr>
+        <w:tc>
+          <w:tcPr>
+            <w:tcW w:w="9360" w:type="dxa"/>
+            <w:shd w:val="clear" w:color="auto" w:fill="F7FAF8"/>
+            <w:tcMar>
+              <w:top w:w="120" w:type="dxa"/>
+              <w:left w:w="200" w:type="dxa"/>
+              <w:bottom w:w="120" w:type="dxa"/>
+              <w:right w:w="200" w:type="dxa"/>
+            </w:tcMar>
+            <w:vAlign w:val="top"/>
+          </w:tcPr>
+          <w:p>
+            <w:pPr>
+              <w:spacing w:before="0" w:after="0" w:line="252" w:lineRule="auto"/>
+            </w:pPr>
+            <w:r>
+              <w:rPr>
+                <w:rFonts w:ascii="JetBrains Mono" w:hAnsi="JetBrains Mono" w:eastAsia="JetBrains Mono" w:cs="JetBrains Mono"/>
+                <w:color w:val="17261F"/>
+                <w:sz w:val="16"/>
+                <w:szCs w:val="16"/>
+              </w:rPr>
+              <w:t xml:space="preserve">%%{init: {"theme": "base", "fontFamily": "Segoe UI, Arial, sans-serif", "themeVariables": {"fontFamily": "Segoe UI, Arial, sans-serif", "fontSize": "15px", "primaryColor": "#DDF5EA", "primaryTextColor": "#17261F", "primaryBorderColor": "#067A52", "secondaryColor": "#E3F2FB", "secondaryTextColor": "#17261F", "secondaryBorderColor": "#1F6FA0", "tertiaryColor": "#F2F7F4", "tertiaryTextColor": "#17261F", "tertiaryBorderColor": "#D5E3DC", "lineColor": "#5B6B63", "textColor": "#17261F", "mainBkg": "#DDF5EA", "nodeBorder": "#067A52", "clusterBkg": "#F7FAF8", "clusterBorder": "#D5E3DC", "edgeLabelBackground": "#FFFFFF", "actorBkg": "#067A52", "actorBorder": "#0B3D2B", "actorTextColor": "#FFFFFF", "actorLineColor": "#5B6B63", "signalColor": "#17261F", "signalTextColor": "#17261F", "labelBoxBkgColor": "#0B3D2B", "labelBoxBorderColor": "#0B3D2B", "labelTextColor": "#FFFFFF", "loopTextColor": "#0B3D2B", "noteBkgColor": "#FDF4DD", "noteBorderColor": "#C98D12", "noteTextColor": "#17261F", "activationBkgColor": "#DDF5EA", "activationBorderColor": "#067A52", "attributeBackgroundColorOdd": "#FFFFFF", "attributeBackgroundColorEven": "#F2F7F4"}}}%%</w:t>
+            </w:r>
+          </w:p>
+          <w:p>
+            <w:pPr>
+              <w:spacing w:before="0" w:after="0" w:line="252" w:lineRule="auto"/>
+            </w:pPr>
+            <w:r>
+              <w:rPr>
+                <w:rFonts w:ascii="JetBrains Mono" w:hAnsi="JetBrains Mono" w:eastAsia="JetBrains Mono" w:cs="JetBrains Mono"/>
+                <w:color w:val="17261F"/>
+                <w:sz w:val="16"/>
+                <w:szCs w:val="16"/>
+              </w:rPr>
+              <w:t xml:space="preserve">sequenceDiagram</w:t>
+            </w:r>
+          </w:p>
+          <w:p>
+            <w:pPr>
+              <w:spacing w:before="0" w:after="0" w:line="252" w:lineRule="auto"/>
+            </w:pPr>
+            <w:r>
+              <w:rPr>
+                <w:rFonts w:ascii="JetBrains Mono" w:hAnsi="JetBrains Mono" w:eastAsia="JetBrains Mono" w:cs="JetBrains Mono"/>
+                <w:color w:val="17261F"/>
+                <w:sz w:val="16"/>
+                <w:szCs w:val="16"/>
+              </w:rPr>
+              <w:t xml:space="preserve">  autonumber</w:t>
+            </w:r>
+          </w:p>
+          <w:p>
+            <w:pPr>
+              <w:spacing w:before="0" w:after="0" w:line="252" w:lineRule="auto"/>
+            </w:pPr>
+            <w:r>
+              <w:rPr>
+                <w:rFonts w:ascii="JetBrains Mono" w:hAnsi="JetBrains Mono" w:eastAsia="JetBrains Mono" w:cs="JetBrains Mono"/>
+                <w:color w:val="17261F"/>
+                <w:sz w:val="16"/>
+                <w:szCs w:val="16"/>
+              </w:rPr>
+              <w:t xml:space="preserve">  participant A as SmartPot-API</w:t>
+            </w:r>
+          </w:p>
+          <w:p>
+            <w:pPr>
+              <w:spacing w:before="0" w:after="0" w:line="252" w:lineRule="auto"/>
+            </w:pPr>
+            <w:r>
+              <w:rPr>
+                <w:rFonts w:ascii="JetBrains Mono" w:hAnsi="JetBrains Mono" w:eastAsia="JetBrains Mono" w:cs="JetBrains Mono"/>
+                <w:color w:val="17261F"/>
+                <w:sz w:val="16"/>
+                <w:szCs w:val="16"/>
+              </w:rPr>
+              <w:t xml:space="preserve">  participant C as api.py</w:t>
+            </w:r>
+          </w:p>
+          <w:p>
+            <w:pPr>
+              <w:spacing w:before="0" w:after="0" w:line="252" w:lineRule="auto"/>
+            </w:pPr>
+            <w:r>
+              <w:rPr>
+                <w:rFonts w:ascii="JetBrains Mono" w:hAnsi="JetBrains Mono" w:eastAsia="JetBrains Mono" w:cs="JetBrains Mono"/>
+                <w:color w:val="17261F"/>
+                <w:sz w:val="16"/>
+                <w:szCs w:val="16"/>
+              </w:rPr>
+              <w:t xml:space="preserve">  participant M as PotManager</w:t>
+            </w:r>
+          </w:p>
+          <w:p>
+            <w:pPr>
+              <w:spacing w:before="0" w:after="0" w:line="252" w:lineRule="auto"/>
+            </w:pPr>
+            <w:r>
+              <w:rPr>
+                <w:rFonts w:ascii="JetBrains Mono" w:hAnsi="JetBrains Mono" w:eastAsia="JetBrains Mono" w:cs="JetBrains Mono"/>
+                <w:color w:val="17261F"/>
+                <w:sz w:val="16"/>
+                <w:szCs w:val="16"/>
+              </w:rPr>
+              <w:t xml:space="preserve">  participant D as SimulatedDevice</w:t>
+            </w:r>
+          </w:p>
+          <w:p>
+            <w:pPr>
+              <w:spacing w:before="0" w:after="0" w:line="252" w:lineRule="auto"/>
+            </w:pPr>
+            <w:r>
+              <w:rPr>
+                <w:rFonts w:ascii="JetBrains Mono" w:hAnsi="JetBrains Mono" w:eastAsia="JetBrains Mono" w:cs="JetBrains Mono"/>
+                <w:color w:val="17261F"/>
+                <w:sz w:val="16"/>
+                <w:szCs w:val="16"/>
+              </w:rPr>
+              <w:t xml:space="preserve">  participant B as Broker</w:t>
+            </w:r>
+          </w:p>
+          <w:p>
+            <w:pPr>
+              <w:spacing w:before="0" w:after="0" w:line="252" w:lineRule="auto"/>
+            </w:pPr>
+            <w:r>
+              <w:rPr>
+                <w:rFonts w:ascii="JetBrains Mono" w:hAnsi="JetBrains Mono" w:eastAsia="JetBrains Mono" w:cs="JetBrains Mono"/>
+                <w:color w:val="17261F"/>
+                <w:sz w:val="16"/>
+                <w:szCs w:val="16"/>
+              </w:rPr>
+              <w:t xml:space="preserve">  A-&gt;&gt;C: PUT /v1/pots/{cropId} (clave, especie, modo, lugar, intervalo)</w:t>
+            </w:r>
+          </w:p>
+          <w:p>
+            <w:pPr>
+              <w:spacing w:before="0" w:after="0" w:line="252" w:lineRule="auto"/>
+            </w:pPr>
+            <w:r>
+              <w:rPr>
+                <w:rFonts w:ascii="JetBrains Mono" w:hAnsi="JetBrains Mono" w:eastAsia="JetBrains Mono" w:cs="JetBrains Mono"/>
+                <w:color w:val="17261F"/>
+                <w:sz w:val="16"/>
+                <w:szCs w:val="16"/>
+              </w:rPr>
+              <w:t xml:space="preserve">  C-&gt;&gt;M: crea o cambia el cultivo virtual</w:t>
+            </w:r>
+          </w:p>
+          <w:p>
+            <w:pPr>
+              <w:spacing w:before="0" w:after="0" w:line="252" w:lineRule="auto"/>
+            </w:pPr>
+            <w:r>
+              <w:rPr>
+                <w:rFonts w:ascii="JetBrains Mono" w:hAnsi="JetBrains Mono" w:eastAsia="JetBrains Mono" w:cs="JetBrains Mono"/>
+                <w:color w:val="17261F"/>
+                <w:sz w:val="16"/>
+                <w:szCs w:val="16"/>
+              </w:rPr>
+              <w:t xml:space="preserve">  M-&gt;&gt;D: conecta con usuario cropId y la clave</w:t>
+            </w:r>
+          </w:p>
+          <w:p>
+            <w:pPr>
+              <w:spacing w:before="0" w:after="0" w:line="252" w:lineRule="auto"/>
+            </w:pPr>
+            <w:r>
+              <w:rPr>
+                <w:rFonts w:ascii="JetBrains Mono" w:hAnsi="JetBrains Mono" w:eastAsia="JetBrains Mono" w:cs="JetBrains Mono"/>
+                <w:color w:val="17261F"/>
+                <w:sz w:val="16"/>
+                <w:szCs w:val="16"/>
+              </w:rPr>
+              <w:t xml:space="preserve">  D-&gt;&gt;B: CONNECT con última voluntad offline</w:t>
+            </w:r>
+          </w:p>
+          <w:p>
+            <w:pPr>
+              <w:spacing w:before="0" w:after="0" w:line="252" w:lineRule="auto"/>
+            </w:pPr>
+            <w:r>
+              <w:rPr>
+                <w:rFonts w:ascii="JetBrains Mono" w:hAnsi="JetBrains Mono" w:eastAsia="JetBrains Mono" w:cs="JetBrains Mono"/>
+                <w:color w:val="17261F"/>
+                <w:sz w:val="16"/>
+                <w:szCs w:val="16"/>
+              </w:rPr>
+              <w:t xml:space="preserve">  D-&gt;&gt;B: status online (retenido)</w:t>
+            </w:r>
+          </w:p>
+          <w:p>
+            <w:pPr>
+              <w:spacing w:before="0" w:after="0" w:line="252" w:lineRule="auto"/>
+            </w:pPr>
+            <w:r>
+              <w:rPr>
+                <w:rFonts w:ascii="JetBrains Mono" w:hAnsi="JetBrains Mono" w:eastAsia="JetBrains Mono" w:cs="JetBrains Mono"/>
+                <w:color w:val="17261F"/>
+                <w:sz w:val="16"/>
+                <w:szCs w:val="16"/>
+              </w:rPr>
+              <w:t xml:space="preserve">  loop cada intervalo</w:t>
+            </w:r>
+          </w:p>
+          <w:p>
+            <w:pPr>
+              <w:spacing w:before="0" w:after="0" w:line="252" w:lineRule="auto"/>
+            </w:pPr>
+            <w:r>
+              <w:rPr>
+                <w:rFonts w:ascii="JetBrains Mono" w:hAnsi="JetBrains Mono" w:eastAsia="JetBrains Mono" w:cs="JetBrains Mono"/>
+                <w:color w:val="17261F"/>
+                <w:sz w:val="16"/>
+                <w:szCs w:val="16"/>
+              </w:rPr>
+              <w:t xml:space="preserve">    M-&gt;&gt;M: environment.step → lectura con ruido</w:t>
+            </w:r>
+          </w:p>
+          <w:p>
+            <w:pPr>
+              <w:spacing w:before="0" w:after="0" w:line="252" w:lineRule="auto"/>
+            </w:pPr>
+            <w:r>
+              <w:rPr>
+                <w:rFonts w:ascii="JetBrains Mono" w:hAnsi="JetBrains Mono" w:eastAsia="JetBrains Mono" w:cs="JetBrains Mono"/>
+                <w:color w:val="17261F"/>
+                <w:sz w:val="16"/>
+                <w:szCs w:val="16"/>
+              </w:rPr>
+              <w:t xml:space="preserve">    D-&gt;&gt;B: telemetry</w:t>
+            </w:r>
+          </w:p>
+          <w:p>
+            <w:pPr>
+              <w:spacing w:before="0" w:after="0" w:line="252" w:lineRule="auto"/>
+            </w:pPr>
+            <w:r>
+              <w:rPr>
+                <w:rFonts w:ascii="JetBrains Mono" w:hAnsi="JetBrains Mono" w:eastAsia="JetBrains Mono" w:cs="JetBrains Mono"/>
+                <w:color w:val="17261F"/>
+                <w:sz w:val="16"/>
+                <w:szCs w:val="16"/>
+              </w:rPr>
+              <w:t xml:space="preserve">  end</w:t>
+            </w:r>
+          </w:p>
+          <w:p>
+            <w:pPr>
+              <w:spacing w:before="0" w:after="0" w:line="252" w:lineRule="auto"/>
+            </w:pPr>
+            <w:r>
+              <w:rPr>
+                <w:rFonts w:ascii="JetBrains Mono" w:hAnsi="JetBrains Mono" w:eastAsia="JetBrains Mono" w:cs="JetBrains Mono"/>
+                <w:color w:val="17261F"/>
+                <w:sz w:val="16"/>
+                <w:szCs w:val="16"/>
+              </w:rPr>
+              <w:t xml:space="preserve">  B-&gt;&gt;D: commands {id, actuator, action, durationSeconds}</w:t>
+            </w:r>
+          </w:p>
+          <w:p>
+            <w:pPr>
+              <w:spacing w:before="0" w:after="0" w:line="252" w:lineRule="auto"/>
+            </w:pPr>
+            <w:r>
+              <w:rPr>
+                <w:rFonts w:ascii="JetBrains Mono" w:hAnsi="JetBrains Mono" w:eastAsia="JetBrains Mono" w:cs="JetBrains Mono"/>
+                <w:color w:val="17261F"/>
+                <w:sz w:val="16"/>
+                <w:szCs w:val="16"/>
+              </w:rPr>
+              <w:t xml:space="preserve">  D-&gt;&gt;M: environment.apply</w:t>
+            </w:r>
+          </w:p>
+          <w:p>
+            <w:pPr>
+              <w:spacing w:before="0" w:after="0" w:line="252" w:lineRule="auto"/>
+            </w:pPr>
+            <w:r>
+              <w:rPr>
+                <w:rFonts w:ascii="JetBrains Mono" w:hAnsi="JetBrains Mono" w:eastAsia="JetBrains Mono" w:cs="JetBrains Mono"/>
+                <w:color w:val="17261F"/>
+                <w:sz w:val="16"/>
+                <w:szCs w:val="16"/>
+              </w:rPr>
+              <w:t xml:space="preserve">  D-&gt;&gt;B: commands/ack EXECUTED con el mensaje</w:t>
+            </w:r>
+          </w:p>
+          <w:p>
+            <w:pPr>
+              <w:spacing w:before="0" w:after="0" w:line="252" w:lineRule="auto"/>
+            </w:pPr>
+            <w:r>
+              <w:rPr>
+                <w:rFonts w:ascii="JetBrains Mono" w:hAnsi="JetBrains Mono" w:eastAsia="JetBrains Mono" w:cs="JetBrains Mono"/>
+                <w:color w:val="17261F"/>
+                <w:sz w:val="16"/>
+                <w:szCs w:val="16"/>
+              </w:rPr>
+              <w:t xml:space="preserve">  A-&gt;&gt;C: GET /v1/pots/{cropId}</w:t>
+            </w:r>
+          </w:p>
+          <w:p>
+            <w:pPr>
+              <w:spacing w:before="0" w:after="0" w:line="252" w:lineRule="auto"/>
+            </w:pPr>
+            <w:r>
+              <w:rPr>
+                <w:rFonts w:ascii="JetBrains Mono" w:hAnsi="JetBrains Mono" w:eastAsia="JetBrains Mono" w:cs="JetBrains Mono"/>
+                <w:color w:val="17261F"/>
+                <w:sz w:val="16"/>
+                <w:szCs w:val="16"/>
+              </w:rPr>
+              <w:t xml:space="preserve">  C--&gt;&gt;A: modo, lectura, clima, actuadores encendidos y último comando</w:t>
+            </w:r>
+          </w:p>
+          <w:p>
+            <w:pPr>
+              <w:spacing w:before="0" w:after="0" w:line="252" w:lineRule="auto"/>
+            </w:pPr>
+            <w:r>
+              <w:rPr>
+                <w:rFonts w:ascii="JetBrains Mono" w:hAnsi="JetBrains Mono" w:eastAsia="JetBrains Mono" w:cs="JetBrains Mono"/>
+                <w:color w:val="17261F"/>
+                <w:sz w:val="16"/>
+                <w:szCs w:val="16"/>
+              </w:rPr>
+              <w:t xml:space="preserve">  A-&gt;&gt;C: DELETE /v1/pots/{cropId} (pausa o borrado)</w:t>
+            </w:r>
+          </w:p>
+          <w:p>
+            <w:pPr>
+              <w:spacing w:before="0" w:after="0" w:line="252" w:lineRule="auto"/>
+            </w:pPr>
+            <w:r>
+              <w:rPr>
+                <w:rFonts w:ascii="JetBrains Mono" w:hAnsi="JetBrains Mono" w:eastAsia="JetBrains Mono" w:cs="JetBrains Mono"/>
+                <w:color w:val="17261F"/>
+                <w:sz w:val="16"/>
+                <w:szCs w:val="16"/>
+              </w:rPr>
+              <w:t xml:space="preserve">  D-&gt;&gt;B: status offline y desconexión</w:t>
+            </w:r>
+          </w:p>
+          <w:p>
+            <w:pPr>
+              <w:spacing w:before="0" w:after="0" w:line="252" w:lineRule="auto"/>
+            </w:pPr>
+            <w:r>
+              <w:rPr>
+                <w:rFonts w:ascii="JetBrains Mono" w:hAnsi="JetBrains Mono" w:eastAsia="JetBrains Mono" w:cs="JetBrains Mono"/>
+                <w:color w:val="17261F"/>
+                <w:sz w:val="16"/>
+                <w:szCs w:val="16"/>
+              </w:rPr>
+              <w:t xml:space="preserve">  Note over A,C: Cada minuto la API compara con GET /v1/pots:&lt;br/&gt;recrea las simulaciones activas que falten y retira las demás</w:t>
+            </w:r>
+          </w:p>
+        </w:tc>
+      </w:tr>
+    </w:tbl>
+    <w:p>
+      <w:pPr>
+        <w:spacing w:before="160" w:after="0" w:line="240" w:lineRule="auto"/>
+        <w:rPr>
+          <w:sz w:val="8"/>
+        </w:rPr>
+      </w:pPr>
+    </w:p>
+    <w:p>
+      <w:pPr>
         <w:spacing w:before="0" w:after="140" w:line="288" w:lineRule="auto"/>
       </w:pPr>
       <w:r>
@@ -2152,7 +3206,7 @@
       <w:r>
         <w:drawing>
           <wp:inline distT="0" distB="0" distL="0" distR="0">
-            <wp:extent cx="8229600" cy="1425445"/>
+            <wp:extent cx="8229600" cy="1330569"/>
             <wp:docPr id="111" name="SmartPot_DataGenerator_02_Environment_Model"/>
             <wp:cNvGraphicFramePr>
               <a:graphicFrameLocks noChangeAspect="1"/>
@@ -2173,7 +3227,7 @@
                   <pic:spPr>
                     <a:xfrm>
                       <a:off x="0" y="0"/>
-                      <a:ext cx="8229600" cy="1425445"/>
+                      <a:ext cx="8229600" cy="1330569"/>
                     </a:xfrm>
                     <a:prstGeom prst="rect">
                       <a:avLst/>
@@ -2225,6 +3279,638 @@
           <w:pgMar w:top="1700" w:right="1440" w:bottom="1440" w:left="1440" w:header="700" w:footer="620" w:gutter="0"/>
           <w:cols w:space="720"/>
         </w:sectPr>
+      </w:pPr>
+    </w:p>
+    <w:p>
+      <w:pPr>
+        <w:spacing w:before="80" w:after="0" w:line="240" w:lineRule="auto"/>
+        <w:rPr>
+          <w:sz w:val="8"/>
+        </w:rPr>
+      </w:pPr>
+    </w:p>
+    <w:tbl>
+      <w:tblPr>
+        <w:tblW w:w="9360" w:type="dxa"/>
+        <w:tblInd w:w="0" w:type="dxa"/>
+        <w:tblBorders>
+          <w:top w:val="nil"/>
+          <w:left w:val="nil"/>
+          <w:bottom w:val="nil"/>
+          <w:right w:val="nil"/>
+          <w:insideH w:val="nil"/>
+          <w:insideV w:val="nil"/>
+        </w:tblBorders>
+        <w:tblLayout w:type="fixed"/>
+        <w:tblCellMar>
+          <w:left w:w="0" w:type="dxa"/>
+          <w:right w:w="0" w:type="dxa"/>
+        </w:tblCellMar>
+        <w:tblLook w:val="0000" w:firstRow="0" w:lastRow="0" w:firstColumn="0" w:lastColumn="0" w:noHBand="1" w:noVBand="1"/>
+      </w:tblPr>
+      <w:tblGrid>
+        <w:gridCol w:w="9360"/>
+      </w:tblGrid>
+      <w:tr>
+        <w:trPr>
+          <w:cantSplit/>
+        </w:trPr>
+        <w:tc>
+          <w:tcPr>
+            <w:tcW w:w="9360" w:type="dxa"/>
+            <w:shd w:val="clear" w:color="auto" w:fill="0B3D2B"/>
+            <w:tcMar>
+              <w:top w:w="60" w:type="dxa"/>
+              <w:left w:w="200" w:type="dxa"/>
+              <w:bottom w:w="60" w:type="dxa"/>
+              <w:right w:w="200" w:type="dxa"/>
+            </w:tcMar>
+            <w:vAlign w:val="top"/>
+          </w:tcPr>
+          <w:p>
+            <w:pPr>
+              <w:spacing w:before="0" w:after="0" w:line="240" w:lineRule="auto"/>
+            </w:pPr>
+            <w:r>
+              <w:rPr>
+                <w:b/>
+                <w:bCs/>
+                <w:color w:val="7FDBB0"/>
+                <w:spacing w:val="40"/>
+                <w:sz w:val="14"/>
+                <w:szCs w:val="14"/>
+              </w:rPr>
+              <w:t xml:space="preserve">MERMAID</w:t>
+            </w:r>
+          </w:p>
+        </w:tc>
+      </w:tr>
+    </w:tbl>
+    <w:tbl>
+      <w:tblPr>
+        <w:tblW w:w="9360" w:type="dxa"/>
+        <w:tblInd w:w="0" w:type="dxa"/>
+        <w:tblBorders>
+          <w:top w:val="nil"/>
+          <w:left w:val="nil"/>
+          <w:bottom w:val="nil"/>
+          <w:right w:val="nil"/>
+          <w:insideH w:val="nil"/>
+          <w:insideV w:val="nil"/>
+        </w:tblBorders>
+        <w:tblLayout w:type="fixed"/>
+        <w:tblCellMar>
+          <w:left w:w="0" w:type="dxa"/>
+          <w:right w:w="0" w:type="dxa"/>
+        </w:tblCellMar>
+        <w:tblLook w:val="0000" w:firstRow="0" w:lastRow="0" w:firstColumn="0" w:lastColumn="0" w:noHBand="1" w:noVBand="1"/>
+      </w:tblPr>
+      <w:tblGrid>
+        <w:gridCol w:w="9360"/>
+      </w:tblGrid>
+      <w:tr>
+        <w:trPr>
+          <w:cantSplit/>
+        </w:trPr>
+        <w:tc>
+          <w:tcPr>
+            <w:tcW w:w="9360" w:type="dxa"/>
+            <w:shd w:val="clear" w:color="auto" w:fill="F7FAF8"/>
+            <w:tcMar>
+              <w:top w:w="120" w:type="dxa"/>
+              <w:left w:w="200" w:type="dxa"/>
+              <w:bottom w:w="120" w:type="dxa"/>
+              <w:right w:w="200" w:type="dxa"/>
+            </w:tcMar>
+            <w:vAlign w:val="top"/>
+          </w:tcPr>
+          <w:p>
+            <w:pPr>
+              <w:spacing w:before="0" w:after="0" w:line="252" w:lineRule="auto"/>
+            </w:pPr>
+            <w:r>
+              <w:rPr>
+                <w:rFonts w:ascii="JetBrains Mono" w:hAnsi="JetBrains Mono" w:eastAsia="JetBrains Mono" w:cs="JetBrains Mono"/>
+                <w:color w:val="17261F"/>
+                <w:sz w:val="16"/>
+                <w:szCs w:val="16"/>
+              </w:rPr>
+              <w:t xml:space="preserve">%%{init: {"theme": "base", "fontFamily": "Segoe UI, Arial, sans-serif", "themeVariables": {"fontFamily": "Segoe UI, Arial, sans-serif", "fontSize": "15px", "primaryColor": "#DDF5EA", "primaryTextColor": "#17261F", "primaryBorderColor": "#067A52", "secondaryColor": "#E3F2FB", "secondaryTextColor": "#17261F", "secondaryBorderColor": "#1F6FA0", "tertiaryColor": "#F2F7F4", "tertiaryTextColor": "#17261F", "tertiaryBorderColor": "#D5E3DC", "lineColor": "#5B6B63", "textColor": "#17261F", "mainBkg": "#DDF5EA", "nodeBorder": "#067A52", "clusterBkg": "#F7FAF8", "clusterBorder": "#D5E3DC", "edgeLabelBackground": "#FFFFFF", "actorBkg": "#067A52", "actorBorder": "#0B3D2B", "actorTextColor": "#FFFFFF", "actorLineColor": "#5B6B63", "signalColor": "#17261F", "signalTextColor": "#17261F", "labelBoxBkgColor": "#0B3D2B", "labelBoxBorderColor": "#0B3D2B", "labelTextColor": "#FFFFFF", "loopTextColor": "#0B3D2B", "noteBkgColor": "#FDF4DD", "noteBorderColor": "#C98D12", "noteTextColor": "#17261F", "activationBkgColor": "#DDF5EA", "activationBorderColor": "#067A52", "attributeBackgroundColorOdd": "#FFFFFF", "attributeBackgroundColorEven": "#F2F7F4"}}}%%</w:t>
+            </w:r>
+          </w:p>
+          <w:p>
+            <w:pPr>
+              <w:spacing w:before="0" w:after="0" w:line="252" w:lineRule="auto"/>
+            </w:pPr>
+            <w:r>
+              <w:rPr>
+                <w:rFonts w:ascii="JetBrains Mono" w:hAnsi="JetBrains Mono" w:eastAsia="JetBrains Mono" w:cs="JetBrains Mono"/>
+                <w:color w:val="17261F"/>
+                <w:sz w:val="16"/>
+                <w:szCs w:val="16"/>
+              </w:rPr>
+              <w:t xml:space="preserve">flowchart LR</w:t>
+            </w:r>
+          </w:p>
+          <w:p>
+            <w:pPr>
+              <w:spacing w:before="0" w:after="0" w:line="252" w:lineRule="auto"/>
+            </w:pPr>
+            <w:r>
+              <w:rPr>
+                <w:rFonts w:ascii="JetBrains Mono" w:hAnsi="JetBrains Mono" w:eastAsia="JetBrains Mono" w:cs="JetBrains Mono"/>
+                <w:color w:val="17261F"/>
+                <w:sz w:val="16"/>
+                <w:szCs w:val="16"/>
+              </w:rPr>
+              <w:t xml:space="preserve">  subgraph objetivo["Objetivo según el modo"]</w:t>
+            </w:r>
+          </w:p>
+          <w:p>
+            <w:pPr>
+              <w:spacing w:before="0" w:after="0" w:line="252" w:lineRule="auto"/>
+            </w:pPr>
+            <w:r>
+              <w:rPr>
+                <w:rFonts w:ascii="JetBrains Mono" w:hAnsi="JetBrains Mono" w:eastAsia="JetBrains Mono" w:cs="JetBrains Mono"/>
+                <w:color w:val="17261F"/>
+                <w:sz w:val="16"/>
+                <w:szCs w:val="16"/>
+              </w:rPr>
+              <w:t xml:space="preserve">    direction TB</w:t>
+            </w:r>
+          </w:p>
+          <w:p>
+            <w:pPr>
+              <w:spacing w:before="0" w:after="0" w:line="252" w:lineRule="auto"/>
+            </w:pPr>
+            <w:r>
+              <w:rPr>
+                <w:rFonts w:ascii="JetBrains Mono" w:hAnsi="JetBrains Mono" w:eastAsia="JetBrains Mono" w:cs="JetBrains Mono"/>
+                <w:color w:val="17261F"/>
+                <w:sz w:val="16"/>
+                <w:szCs w:val="16"/>
+              </w:rPr>
+              <w:t xml:space="preserve">    auto["AUTO&lt;br/&gt;línea base de la especie&lt;br/&gt;con ciclo de día y noche"]</w:t>
+            </w:r>
+          </w:p>
+          <w:p>
+            <w:pPr>
+              <w:spacing w:before="0" w:after="0" w:line="252" w:lineRule="auto"/>
+            </w:pPr>
+            <w:r>
+              <w:rPr>
+                <w:rFonts w:ascii="JetBrains Mono" w:hAnsi="JetBrains Mono" w:eastAsia="JetBrains Mono" w:cs="JetBrains Mono"/>
+                <w:color w:val="17261F"/>
+                <w:sz w:val="16"/>
+                <w:szCs w:val="16"/>
+              </w:rPr>
+              <w:t xml:space="preserve">    manual["MANUAL&lt;br/&gt;los medidores que mueve la persona"]</w:t>
+            </w:r>
+          </w:p>
+          <w:p>
+            <w:pPr>
+              <w:spacing w:before="0" w:after="0" w:line="252" w:lineRule="auto"/>
+            </w:pPr>
+            <w:r>
+              <w:rPr>
+                <w:rFonts w:ascii="JetBrains Mono" w:hAnsi="JetBrains Mono" w:eastAsia="JetBrains Mono" w:cs="JetBrains Mono"/>
+                <w:color w:val="17261F"/>
+                <w:sz w:val="16"/>
+                <w:szCs w:val="16"/>
+              </w:rPr>
+              <w:t xml:space="preserve">    weather["WEATHER&lt;br/&gt;temperatura, humedad y presión del lugar&lt;br/&gt;radiación × 2,2 → luz del sensor&lt;br/&gt;lluvia → sustrato · sol y aire seco → secado"]</w:t>
+            </w:r>
+          </w:p>
+          <w:p>
+            <w:pPr>
+              <w:spacing w:before="0" w:after="0" w:line="252" w:lineRule="auto"/>
+            </w:pPr>
+            <w:r>
+              <w:rPr>
+                <w:rFonts w:ascii="JetBrains Mono" w:hAnsi="JetBrains Mono" w:eastAsia="JetBrains Mono" w:cs="JetBrains Mono"/>
+                <w:color w:val="17261F"/>
+                <w:sz w:val="16"/>
+                <w:szCs w:val="16"/>
+              </w:rPr>
+              <w:t xml:space="preserve">  end</w:t>
+            </w:r>
+          </w:p>
+          <w:p>
+            <w:pPr>
+              <w:spacing w:before="0" w:after="0" w:line="252" w:lineRule="auto"/>
+            </w:pPr>
+            <w:r>
+              <w:rPr>
+                <w:rFonts w:ascii="JetBrains Mono" w:hAnsi="JetBrains Mono" w:eastAsia="JetBrains Mono" w:cs="JetBrains Mono"/>
+                <w:color w:val="17261F"/>
+                <w:sz w:val="16"/>
+                <w:szCs w:val="16"/>
+              </w:rPr>
+              <w:t xml:space="preserve">  subgraph actuadores["Efecto de los actuadores"]</w:t>
+            </w:r>
+          </w:p>
+          <w:p>
+            <w:pPr>
+              <w:spacing w:before="0" w:after="0" w:line="252" w:lineRule="auto"/>
+            </w:pPr>
+            <w:r>
+              <w:rPr>
+                <w:rFonts w:ascii="JetBrains Mono" w:hAnsi="JetBrains Mono" w:eastAsia="JetBrains Mono" w:cs="JetBrains Mono"/>
+                <w:color w:val="17261F"/>
+                <w:sz w:val="16"/>
+                <w:szCs w:val="16"/>
+              </w:rPr>
+              <w:t xml:space="preserve">    direction TB</w:t>
+            </w:r>
+          </w:p>
+          <w:p>
+            <w:pPr>
+              <w:spacing w:before="0" w:after="0" w:line="252" w:lineRule="auto"/>
+            </w:pPr>
+            <w:r>
+              <w:rPr>
+                <w:rFonts w:ascii="JetBrains Mono" w:hAnsi="JetBrains Mono" w:eastAsia="JetBrains Mono" w:cs="JetBrains Mono"/>
+                <w:color w:val="17261F"/>
+                <w:sz w:val="16"/>
+                <w:szCs w:val="16"/>
+              </w:rPr>
+              <w:t xml:space="preserve">    pump["Bomba · +1,2 % de sustrato por segundo"]</w:t>
+            </w:r>
+          </w:p>
+          <w:p>
+            <w:pPr>
+              <w:spacing w:before="0" w:after="0" w:line="252" w:lineRule="auto"/>
+            </w:pPr>
+            <w:r>
+              <w:rPr>
+                <w:rFonts w:ascii="JetBrains Mono" w:hAnsi="JetBrains Mono" w:eastAsia="JetBrains Mono" w:cs="JetBrains Mono"/>
+                <w:color w:val="17261F"/>
+                <w:sz w:val="16"/>
+                <w:szCs w:val="16"/>
+              </w:rPr>
+              <w:t xml:space="preserve">    fan["Ventilador · −0,35 °C y −1,5 % de humedad por minuto"]</w:t>
+            </w:r>
+          </w:p>
+          <w:p>
+            <w:pPr>
+              <w:spacing w:before="0" w:after="0" w:line="252" w:lineRule="auto"/>
+            </w:pPr>
+            <w:r>
+              <w:rPr>
+                <w:rFonts w:ascii="JetBrains Mono" w:hAnsi="JetBrains Mono" w:eastAsia="JetBrains Mono" w:cs="JetBrains Mono"/>
+                <w:color w:val="17261F"/>
+                <w:sz w:val="16"/>
+                <w:szCs w:val="16"/>
+              </w:rPr>
+              <w:t xml:space="preserve">    uv["Luz ultravioleta · +900 de luz y +0,05 °C por minuto"]</w:t>
+            </w:r>
+          </w:p>
+          <w:p>
+            <w:pPr>
+              <w:spacing w:before="0" w:after="0" w:line="252" w:lineRule="auto"/>
+            </w:pPr>
+            <w:r>
+              <w:rPr>
+                <w:rFonts w:ascii="JetBrains Mono" w:hAnsi="JetBrains Mono" w:eastAsia="JetBrains Mono" w:cs="JetBrains Mono"/>
+                <w:color w:val="17261F"/>
+                <w:sz w:val="16"/>
+                <w:szCs w:val="16"/>
+              </w:rPr>
+              <w:t xml:space="preserve">    hum["Humidificador · +2,5 % de humedad por minuto"]</w:t>
+            </w:r>
+          </w:p>
+          <w:p>
+            <w:pPr>
+              <w:spacing w:before="0" w:after="0" w:line="252" w:lineRule="auto"/>
+            </w:pPr>
+            <w:r>
+              <w:rPr>
+                <w:rFonts w:ascii="JetBrains Mono" w:hAnsi="JetBrains Mono" w:eastAsia="JetBrains Mono" w:cs="JetBrains Mono"/>
+                <w:color w:val="17261F"/>
+                <w:sz w:val="16"/>
+                <w:szCs w:val="16"/>
+              </w:rPr>
+              <w:t xml:space="preserve">    ph["Dosificador de pH · −0,12 de pH por segundo de dosis"]</w:t>
+            </w:r>
+          </w:p>
+          <w:p>
+            <w:pPr>
+              <w:spacing w:before="0" w:after="0" w:line="252" w:lineRule="auto"/>
+            </w:pPr>
+            <w:r>
+              <w:rPr>
+                <w:rFonts w:ascii="JetBrains Mono" w:hAnsi="JetBrains Mono" w:eastAsia="JetBrains Mono" w:cs="JetBrains Mono"/>
+                <w:color w:val="17261F"/>
+                <w:sz w:val="16"/>
+                <w:szCs w:val="16"/>
+              </w:rPr>
+              <w:t xml:space="preserve">    nut["Dosificador de nutrientes · +70 ppm por segundo de dosis"]</w:t>
+            </w:r>
+          </w:p>
+          <w:p>
+            <w:pPr>
+              <w:spacing w:before="0" w:after="0" w:line="252" w:lineRule="auto"/>
+            </w:pPr>
+            <w:r>
+              <w:rPr>
+                <w:rFonts w:ascii="JetBrains Mono" w:hAnsi="JetBrains Mono" w:eastAsia="JetBrains Mono" w:cs="JetBrains Mono"/>
+                <w:color w:val="17261F"/>
+                <w:sz w:val="16"/>
+                <w:szCs w:val="16"/>
+              </w:rPr>
+              <w:t xml:space="preserve">  end</w:t>
+            </w:r>
+          </w:p>
+          <w:p>
+            <w:pPr>
+              <w:spacing w:before="0" w:after="0" w:line="252" w:lineRule="auto"/>
+            </w:pPr>
+            <w:r>
+              <w:rPr>
+                <w:rFonts w:ascii="JetBrains Mono" w:hAnsi="JetBrains Mono" w:eastAsia="JetBrains Mono" w:cs="JetBrains Mono"/>
+                <w:color w:val="17261F"/>
+                <w:sz w:val="16"/>
+                <w:szCs w:val="16"/>
+              </w:rPr>
+              <w:t xml:space="preserve">  place["Lugar del cultivo&lt;br/&gt;bajo techo: el clima llega amortiguado y no llueve&lt;br/&gt;media sombra y sombra: menos luz y calor"]</w:t>
+            </w:r>
+          </w:p>
+          <w:p>
+            <w:pPr>
+              <w:spacing w:before="0" w:after="0" w:line="252" w:lineRule="auto"/>
+            </w:pPr>
+            <w:r>
+              <w:rPr>
+                <w:rFonts w:ascii="JetBrains Mono" w:hAnsi="JetBrains Mono" w:eastAsia="JetBrains Mono" w:cs="JetBrains Mono"/>
+                <w:color w:val="17261F"/>
+                <w:sz w:val="16"/>
+                <w:szCs w:val="16"/>
+              </w:rPr>
+              <w:t xml:space="preserve">  relax["step&lt;br/&gt;cada variable se acerca a su objetivo&lt;br/&gt;evaporación del sustrato"]</w:t>
+            </w:r>
+          </w:p>
+          <w:p>
+            <w:pPr>
+              <w:spacing w:before="0" w:after="0" w:line="252" w:lineRule="auto"/>
+            </w:pPr>
+            <w:r>
+              <w:rPr>
+                <w:rFonts w:ascii="JetBrains Mono" w:hAnsi="JetBrains Mono" w:eastAsia="JetBrains Mono" w:cs="JetBrains Mono"/>
+                <w:color w:val="17261F"/>
+                <w:sz w:val="16"/>
+                <w:szCs w:val="16"/>
+              </w:rPr>
+              <w:t xml:space="preserve">  noise["reading&lt;br/&gt;ruido gaussiano de sensor&lt;br/&gt;límites de la escala"]</w:t>
+            </w:r>
+          </w:p>
+          <w:p>
+            <w:pPr>
+              <w:spacing w:before="0" w:after="0" w:line="252" w:lineRule="auto"/>
+            </w:pPr>
+            <w:r>
+              <w:rPr>
+                <w:rFonts w:ascii="JetBrains Mono" w:hAnsi="JetBrains Mono" w:eastAsia="JetBrains Mono" w:cs="JetBrains Mono"/>
+                <w:color w:val="17261F"/>
+                <w:sz w:val="16"/>
+                <w:szCs w:val="16"/>
+              </w:rPr>
+              <w:t xml:space="preserve">  out(["telemetry&lt;br/&gt;temperature · humidity · brightness · ph&lt;br/&gt;tds · soilMoisture · atmosphere"])</w:t>
+            </w:r>
+          </w:p>
+          <w:p>
+            <w:pPr>
+              <w:spacing w:before="0" w:after="0" w:line="252" w:lineRule="auto"/>
+            </w:pPr>
+            <w:r>
+              <w:rPr>
+                <w:rFonts w:ascii="JetBrains Mono" w:hAnsi="JetBrains Mono" w:eastAsia="JetBrains Mono" w:cs="JetBrains Mono"/>
+                <w:color w:val="17261F"/>
+                <w:sz w:val="16"/>
+                <w:szCs w:val="16"/>
+              </w:rPr>
+              <w:t xml:space="preserve">  objetivo --&gt; relax</w:t>
+            </w:r>
+          </w:p>
+          <w:p>
+            <w:pPr>
+              <w:spacing w:before="0" w:after="0" w:line="252" w:lineRule="auto"/>
+            </w:pPr>
+            <w:r>
+              <w:rPr>
+                <w:rFonts w:ascii="JetBrains Mono" w:hAnsi="JetBrains Mono" w:eastAsia="JetBrains Mono" w:cs="JetBrains Mono"/>
+                <w:color w:val="17261F"/>
+                <w:sz w:val="16"/>
+                <w:szCs w:val="16"/>
+              </w:rPr>
+              <w:t xml:space="preserve">  place --&gt; objetivo</w:t>
+            </w:r>
+          </w:p>
+          <w:p>
+            <w:pPr>
+              <w:spacing w:before="0" w:after="0" w:line="252" w:lineRule="auto"/>
+            </w:pPr>
+            <w:r>
+              <w:rPr>
+                <w:rFonts w:ascii="JetBrains Mono" w:hAnsi="JetBrains Mono" w:eastAsia="JetBrains Mono" w:cs="JetBrains Mono"/>
+                <w:color w:val="17261F"/>
+                <w:sz w:val="16"/>
+                <w:szCs w:val="16"/>
+              </w:rPr>
+              <w:t xml:space="preserve">  actuadores --&gt; relax</w:t>
+            </w:r>
+          </w:p>
+          <w:p>
+            <w:pPr>
+              <w:spacing w:before="0" w:after="0" w:line="252" w:lineRule="auto"/>
+            </w:pPr>
+            <w:r>
+              <w:rPr>
+                <w:rFonts w:ascii="JetBrains Mono" w:hAnsi="JetBrains Mono" w:eastAsia="JetBrains Mono" w:cs="JetBrains Mono"/>
+                <w:color w:val="17261F"/>
+                <w:sz w:val="16"/>
+                <w:szCs w:val="16"/>
+              </w:rPr>
+              <w:t xml:space="preserve">  relax --&gt; noise --&gt; out</w:t>
+            </w:r>
+          </w:p>
+          <w:p>
+            <w:pPr>
+              <w:spacing w:before="0" w:after="0" w:line="252" w:lineRule="auto"/>
+            </w:pPr>
+            <w:r>
+              <w:rPr>
+                <w:rFonts w:ascii="JetBrains Mono" w:hAnsi="JetBrains Mono" w:eastAsia="JetBrains Mono" w:cs="JetBrains Mono"/>
+                <w:color w:val="17261F"/>
+                <w:sz w:val="16"/>
+                <w:szCs w:val="16"/>
+              </w:rPr>
+              <w:t xml:space="preserve">  classDef leaf fill:#DDF5EA,stroke:#067A52,color:#17261F</w:t>
+            </w:r>
+          </w:p>
+          <w:p>
+            <w:pPr>
+              <w:spacing w:before="0" w:after="0" w:line="252" w:lineRule="auto"/>
+            </w:pPr>
+            <w:r>
+              <w:rPr>
+                <w:rFonts w:ascii="JetBrains Mono" w:hAnsi="JetBrains Mono" w:eastAsia="JetBrains Mono" w:cs="JetBrains Mono"/>
+                <w:color w:val="17261F"/>
+                <w:sz w:val="16"/>
+                <w:szCs w:val="16"/>
+              </w:rPr>
+              <w:t xml:space="preserve">  classDef water fill:#E3F2FB,stroke:#1F6FA0,color:#17261F</w:t>
+            </w:r>
+          </w:p>
+          <w:p>
+            <w:pPr>
+              <w:spacing w:before="0" w:after="0" w:line="252" w:lineRule="auto"/>
+            </w:pPr>
+            <w:r>
+              <w:rPr>
+                <w:rFonts w:ascii="JetBrains Mono" w:hAnsi="JetBrains Mono" w:eastAsia="JetBrains Mono" w:cs="JetBrains Mono"/>
+                <w:color w:val="17261F"/>
+                <w:sz w:val="16"/>
+                <w:szCs w:val="16"/>
+              </w:rPr>
+              <w:t xml:space="preserve">  classDef sun fill:#FDF4DD,stroke:#C98D12,color:#17261F</w:t>
+            </w:r>
+          </w:p>
+          <w:p>
+            <w:pPr>
+              <w:spacing w:before="0" w:after="0" w:line="252" w:lineRule="auto"/>
+            </w:pPr>
+            <w:r>
+              <w:rPr>
+                <w:rFonts w:ascii="JetBrains Mono" w:hAnsi="JetBrains Mono" w:eastAsia="JetBrains Mono" w:cs="JetBrains Mono"/>
+                <w:color w:val="17261F"/>
+                <w:sz w:val="16"/>
+                <w:szCs w:val="16"/>
+              </w:rPr>
+              <w:t xml:space="preserve">  classDef clay fill:#FBE9E1,stroke:#B85A38,color:#17261F</w:t>
+            </w:r>
+          </w:p>
+          <w:p>
+            <w:pPr>
+              <w:spacing w:before="0" w:after="0" w:line="252" w:lineRule="auto"/>
+            </w:pPr>
+            <w:r>
+              <w:rPr>
+                <w:rFonts w:ascii="JetBrains Mono" w:hAnsi="JetBrains Mono" w:eastAsia="JetBrains Mono" w:cs="JetBrains Mono"/>
+                <w:color w:val="17261F"/>
+                <w:sz w:val="16"/>
+                <w:szCs w:val="16"/>
+              </w:rPr>
+              <w:t xml:space="preserve">  classDef core fill:#067A52,stroke:#0B3D2B,color:#FFFFFF</w:t>
+            </w:r>
+          </w:p>
+          <w:p>
+            <w:pPr>
+              <w:spacing w:before="0" w:after="0" w:line="252" w:lineRule="auto"/>
+            </w:pPr>
+            <w:r>
+              <w:rPr>
+                <w:rFonts w:ascii="JetBrains Mono" w:hAnsi="JetBrains Mono" w:eastAsia="JetBrains Mono" w:cs="JetBrains Mono"/>
+                <w:color w:val="17261F"/>
+                <w:sz w:val="16"/>
+                <w:szCs w:val="16"/>
+              </w:rPr>
+              <w:t xml:space="preserve">  classDef deep fill:#0B3D2B,stroke:#06281C,color:#FFFFFF</w:t>
+            </w:r>
+          </w:p>
+          <w:p>
+            <w:pPr>
+              <w:spacing w:before="0" w:after="0" w:line="252" w:lineRule="auto"/>
+            </w:pPr>
+            <w:r>
+              <w:rPr>
+                <w:rFonts w:ascii="JetBrains Mono" w:hAnsi="JetBrains Mono" w:eastAsia="JetBrains Mono" w:cs="JetBrains Mono"/>
+                <w:color w:val="17261F"/>
+                <w:sz w:val="16"/>
+                <w:szCs w:val="16"/>
+              </w:rPr>
+              <w:t xml:space="preserve">  classDef muted fill:#F2F7F4,stroke:#5B6B63,color:#17261F</w:t>
+            </w:r>
+          </w:p>
+          <w:p>
+            <w:pPr>
+              <w:spacing w:before="0" w:after="0" w:line="252" w:lineRule="auto"/>
+            </w:pPr>
+            <w:r>
+              <w:rPr>
+                <w:rFonts w:ascii="JetBrains Mono" w:hAnsi="JetBrains Mono" w:eastAsia="JetBrains Mono" w:cs="JetBrains Mono"/>
+                <w:color w:val="17261F"/>
+                <w:sz w:val="16"/>
+                <w:szCs w:val="16"/>
+              </w:rPr>
+              <w:t xml:space="preserve">  class auto,manual,weather sun</w:t>
+            </w:r>
+          </w:p>
+          <w:p>
+            <w:pPr>
+              <w:spacing w:before="0" w:after="0" w:line="252" w:lineRule="auto"/>
+            </w:pPr>
+            <w:r>
+              <w:rPr>
+                <w:rFonts w:ascii="JetBrains Mono" w:hAnsi="JetBrains Mono" w:eastAsia="JetBrains Mono" w:cs="JetBrains Mono"/>
+                <w:color w:val="17261F"/>
+                <w:sz w:val="16"/>
+                <w:szCs w:val="16"/>
+              </w:rPr>
+              <w:t xml:space="preserve">  class pump,fan,uv,hum,ph,nut leaf</w:t>
+            </w:r>
+          </w:p>
+          <w:p>
+            <w:pPr>
+              <w:spacing w:before="0" w:after="0" w:line="252" w:lineRule="auto"/>
+            </w:pPr>
+            <w:r>
+              <w:rPr>
+                <w:rFonts w:ascii="JetBrains Mono" w:hAnsi="JetBrains Mono" w:eastAsia="JetBrains Mono" w:cs="JetBrains Mono"/>
+                <w:color w:val="17261F"/>
+                <w:sz w:val="16"/>
+                <w:szCs w:val="16"/>
+              </w:rPr>
+              <w:t xml:space="preserve">  class relax,noise muted</w:t>
+            </w:r>
+          </w:p>
+          <w:p>
+            <w:pPr>
+              <w:spacing w:before="0" w:after="0" w:line="252" w:lineRule="auto"/>
+            </w:pPr>
+            <w:r>
+              <w:rPr>
+                <w:rFonts w:ascii="JetBrains Mono" w:hAnsi="JetBrains Mono" w:eastAsia="JetBrains Mono" w:cs="JetBrains Mono"/>
+                <w:color w:val="17261F"/>
+                <w:sz w:val="16"/>
+                <w:szCs w:val="16"/>
+              </w:rPr>
+              <w:t xml:space="preserve">  class place water</w:t>
+            </w:r>
+          </w:p>
+          <w:p>
+            <w:pPr>
+              <w:spacing w:before="0" w:after="0" w:line="252" w:lineRule="auto"/>
+            </w:pPr>
+            <w:r>
+              <w:rPr>
+                <w:rFonts w:ascii="JetBrains Mono" w:hAnsi="JetBrains Mono" w:eastAsia="JetBrains Mono" w:cs="JetBrains Mono"/>
+                <w:color w:val="17261F"/>
+                <w:sz w:val="16"/>
+                <w:szCs w:val="16"/>
+              </w:rPr>
+              <w:t xml:space="preserve">  class out core</w:t>
+            </w:r>
+          </w:p>
+        </w:tc>
+      </w:tr>
+    </w:tbl>
+    <w:p>
+      <w:pPr>
+        <w:spacing w:before="160" w:after="0" w:line="240" w:lineRule="auto"/>
+        <w:rPr>
+          <w:sz w:val="8"/>
+        </w:rPr>
       </w:pPr>
     </w:p>
     <w:p>
@@ -2533,7 +4219,7 @@
                 <w:sz w:val="17"/>
                 <w:szCs w:val="17"/>
               </w:rPr>
-              <w:t xml:space="preserve">, abierto y sin clave: la lluvia moja el sustrato y el sol y el aire seco lo secan más rápido</w:t>
+              <w:t xml:space="preserve">, abierto y sin clave: la lluvia moja el sustrato y el sol y el aire seco lo secan más rápido. El lugar lo filtra: bajo techo la temperatura y la humedad se amortiguan y no llueve; la media sombra y la sombra bajan la luz y el calor</w:t>
             </w:r>
           </w:p>
         </w:tc>
@@ -2557,7 +4243,7 @@
           <w:sz w:val="20"/>
           <w:szCs w:val="20"/>
         </w:rPr>
-        <w:t xml:space="preserve">Cada orden responde con un mensaje en español («Bomba de agua encendida por 15 s»); un actuador que no existe responde </w:t>
+        <w:t xml:space="preserve">Los actuadores mueven las lecturas en los tres modos. Encendido sin duración, un actuador sigue así hasta que se apaga; los dosificadores sueltan una dosis de 3 s si no la traen. Tras cada orden ejecutada el cultivo publica una lectura a los 2 s, para que el efecto se vea sin esperar el intervalo. Cada orden responde con un mensaje en español que dice la duración como se lee («Ventilador encendido por 10 min»); un actuador que no existe responde </w:t>
       </w:r>
       <w:r>
         <w:rPr>
@@ -2761,8 +4447,8 @@
       </w:tblPr>
       <w:tblGrid>
         <w:gridCol w:w="960"/>
-        <w:gridCol w:w="2517"/>
-        <w:gridCol w:w="5883"/>
+        <w:gridCol w:w="2456"/>
+        <w:gridCol w:w="5944"/>
       </w:tblGrid>
       <w:tr>
         <w:trPr>
@@ -2800,7 +4486,7 @@
         </w:tc>
         <w:tc>
           <w:tcPr>
-            <w:tcW w:w="2517" w:type="dxa"/>
+            <w:tcW w:w="2456" w:type="dxa"/>
             <w:shd w:val="clear" w:color="auto" w:fill="0B3D2B"/>
             <w:tcMar>
               <w:top w:w="70" w:type="dxa"/>
@@ -2829,7 +4515,7 @@
         </w:tc>
         <w:tc>
           <w:tcPr>
-            <w:tcW w:w="5883" w:type="dxa"/>
+            <w:tcW w:w="5944" w:type="dxa"/>
             <w:shd w:val="clear" w:color="auto" w:fill="0B3D2B"/>
             <w:tcMar>
               <w:top w:w="70" w:type="dxa"/>
@@ -2891,7 +4577,7 @@
         </w:tc>
         <w:tc>
           <w:tcPr>
-            <w:tcW w:w="2517" w:type="dxa"/>
+            <w:tcW w:w="2456" w:type="dxa"/>
             <w:shd w:val="clear" w:color="auto" w:fill="FFFFFF"/>
             <w:tcMar>
               <w:top w:w="70" w:type="dxa"/>
@@ -2918,7 +4604,7 @@
         </w:tc>
         <w:tc>
           <w:tcPr>
-            <w:tcW w:w="5883" w:type="dxa"/>
+            <w:tcW w:w="5944" w:type="dxa"/>
             <w:shd w:val="clear" w:color="auto" w:fill="FFFFFF"/>
             <w:tcMar>
               <w:top w:w="70" w:type="dxa"/>
@@ -2977,7 +4663,7 @@
         </w:tc>
         <w:tc>
           <w:tcPr>
-            <w:tcW w:w="2517" w:type="dxa"/>
+            <w:tcW w:w="2456" w:type="dxa"/>
             <w:shd w:val="clear" w:color="auto" w:fill="F2F7F4"/>
             <w:tcMar>
               <w:top w:w="70" w:type="dxa"/>
@@ -3021,7 +4707,7 @@
         </w:tc>
         <w:tc>
           <w:tcPr>
-            <w:tcW w:w="5883" w:type="dxa"/>
+            <w:tcW w:w="5944" w:type="dxa"/>
             <w:shd w:val="clear" w:color="auto" w:fill="F2F7F4"/>
             <w:tcMar>
               <w:top w:w="70" w:type="dxa"/>
@@ -3080,7 +4766,7 @@
         </w:tc>
         <w:tc>
           <w:tcPr>
-            <w:tcW w:w="2517" w:type="dxa"/>
+            <w:tcW w:w="2456" w:type="dxa"/>
             <w:shd w:val="clear" w:color="auto" w:fill="FFFFFF"/>
             <w:tcMar>
               <w:top w:w="70" w:type="dxa"/>
@@ -3107,7 +4793,7 @@
         </w:tc>
         <w:tc>
           <w:tcPr>
-            <w:tcW w:w="5883" w:type="dxa"/>
+            <w:tcW w:w="5944" w:type="dxa"/>
             <w:shd w:val="clear" w:color="auto" w:fill="FFFFFF"/>
             <w:tcMar>
               <w:top w:w="70" w:type="dxa"/>
@@ -3205,6 +4891,40 @@
                 <w:szCs w:val="15"/>
               </w:rPr>
               <w:t xml:space="preserve">location</w:t>
+            </w:r>
+            <w:r>
+              <w:rPr>
+                <w:color w:val="17261F"/>
+                <w:sz w:val="17"/>
+                <w:szCs w:val="17"/>
+              </w:rPr>
+              <w:t xml:space="preserve">, </w:t>
+            </w:r>
+            <w:r>
+              <w:rPr>
+                <w:rFonts w:ascii="JetBrains Mono" w:hAnsi="JetBrains Mono" w:eastAsia="JetBrains Mono" w:cs="JetBrains Mono"/>
+                <w:color w:val="0A5A3C"/>
+                <w:sz w:val="15"/>
+                <w:szCs w:val="15"/>
+              </w:rPr>
+              <w:t xml:space="preserve">setting</w:t>
+            </w:r>
+            <w:r>
+              <w:rPr>
+                <w:color w:val="17261F"/>
+                <w:sz w:val="17"/>
+                <w:szCs w:val="17"/>
+              </w:rPr>
+              <w:t xml:space="preserve">, </w:t>
+            </w:r>
+            <w:r>
+              <w:rPr>
+                <w:rFonts w:ascii="JetBrains Mono" w:hAnsi="JetBrains Mono" w:eastAsia="JetBrains Mono" w:cs="JetBrains Mono"/>
+                <w:color w:val="0A5A3C"/>
+                <w:sz w:val="15"/>
+                <w:szCs w:val="15"/>
+              </w:rPr>
+              <w:t xml:space="preserve">exposure</w:t>
             </w:r>
             <w:r>
               <w:rPr>
@@ -3260,7 +4980,7 @@
         </w:tc>
         <w:tc>
           <w:tcPr>
-            <w:tcW w:w="2517" w:type="dxa"/>
+            <w:tcW w:w="2456" w:type="dxa"/>
             <w:shd w:val="clear" w:color="auto" w:fill="F2F7F4"/>
             <w:tcMar>
               <w:top w:w="70" w:type="dxa"/>
@@ -3287,7 +5007,7 @@
         </w:tc>
         <w:tc>
           <w:tcPr>
-            <w:tcW w:w="5883" w:type="dxa"/>
+            <w:tcW w:w="5944" w:type="dxa"/>
             <w:shd w:val="clear" w:color="auto" w:fill="F2F7F4"/>
             <w:tcMar>
               <w:top w:w="70" w:type="dxa"/>
@@ -3355,7 +5075,7 @@
         </w:tc>
         <w:tc>
           <w:tcPr>
-            <w:tcW w:w="2517" w:type="dxa"/>
+            <w:tcW w:w="2456" w:type="dxa"/>
             <w:shd w:val="clear" w:color="auto" w:fill="FFFFFF"/>
             <w:tcMar>
               <w:top w:w="70" w:type="dxa"/>
@@ -3399,7 +5119,7 @@
         </w:tc>
         <w:tc>
           <w:tcPr>
-            <w:tcW w:w="5883" w:type="dxa"/>
+            <w:tcW w:w="5944" w:type="dxa"/>
             <w:shd w:val="clear" w:color="auto" w:fill="FFFFFF"/>
             <w:tcMar>
               <w:top w:w="70" w:type="dxa"/>
@@ -4348,7 +6068,7 @@
           <w:sz w:val="20"/>
           <w:szCs w:val="20"/>
         </w:rPr>
-        <w:t xml:space="preserve">: 23 pruebas sobre el modelo físico, los modos manual y clima, la lluvia y el sol, la caché del clima, el contrato de tópicos, los comandos y su ACK y la API de control.</w:t>
+        <w:t xml:space="preserve">: 34 pruebas sobre el modelo físico, el efecto de los actuadores en los tres modos, los actuadores sin duración, el lugar y el clima, la lluvia y el sol, la caché del clima, el contrato de tópicos, los comandos con su ACK y su mensaje, la lectura tras una orden y la API de control.</w:t>
       </w:r>
     </w:p>
     <w:p>
@@ -4913,7 +6633,7 @@
               <w:sz w:val="14"/>
               <w:szCs w:val="14"/>
             </w:rPr>
-            <w:t xml:space="preserve">SMARTPOT-DATAGENERATOR · V1.0</w:t>
+            <w:t xml:space="preserve">SMARTPOT-DATAGENERATOR · V1.1</w:t>
           </w:r>
         </w:p>
       </w:tc>

</xml_diff>